<commit_message>
Docs: publicación en Railway en el manual de instalación
</commit_message>
<xml_diff>
--- a/docs/para-drive/Manual de instalación.docx
+++ b/docs/para-drive/Manual de instalación.docx
@@ -2,7 +2,7 @@
 <file path=word/document.xml><?xml version="1.0" encoding="utf-8"?>
 <w:document xmlns:w="http://schemas.openxmlformats.org/wordprocessingml/2006/main" xmlns:m="http://schemas.openxmlformats.org/officeDocument/2006/math" xmlns:r="http://schemas.openxmlformats.org/officeDocument/2006/relationships" xmlns:o="urn:schemas-microsoft-com:office:office" xmlns:v="urn:schemas-microsoft-com:vml" xmlns:w10="urn:schemas-microsoft-com:office:word" xmlns:a="http://schemas.openxmlformats.org/drawingml/2006/main" xmlns:pic="http://schemas.openxmlformats.org/drawingml/2006/picture" xmlns:wp="http://schemas.openxmlformats.org/drawingml/2006/wordprocessingDrawing">
   <w:body>
-    <w:bookmarkStart w:id="39" w:name="manual-de-instalación-arte-odontológico"/>
+    <w:bookmarkStart w:id="42" w:name="manual-de-instalación-arte-odontológico"/>
     <w:p>
       <w:pPr>
         <w:pStyle w:val="Heading1"/>
@@ -74,7 +74,7 @@
         <w:t xml:space="preserve"> </w:t>
       </w:r>
       <w:r>
-        <w:t xml:space="preserve">0.9 (borrador) · 6 de octubre de 2026</w:t>
+        <w:t xml:space="preserve">0.95 (borrador) · 10 de octubre de 2026</w:t>
       </w:r>
     </w:p>
     <w:p>
@@ -82,7 +82,7 @@
         <w:pStyle w:val="BlockText"/>
       </w:pPr>
       <w:r>
-        <w:t xml:space="preserve">Pendiente: completar la sección 8 (publicación en servidor) cuando se elija el proveedor, y pasar el documento a la plantilla oficial de la FET.</w:t>
+        <w:t xml:space="preserve">Pendiente: confirmar el proveedor (la sección 8.2 describe Railway, la opción recomendada) y pasar el documento a la plantilla oficial de la FET.</w:t>
       </w:r>
     </w:p>
     <w:bookmarkStart w:id="20" w:name="propósito"/>
@@ -4267,13 +4267,13 @@
       </w:r>
     </w:p>
     <w:bookmarkEnd w:id="35"/>
-    <w:bookmarkStart w:id="36" w:name="frontend"/>
+    <w:bookmarkStart w:id="39" w:name="frontend-y-publicación"/>
     <w:p>
       <w:pPr>
         <w:pStyle w:val="Heading2"/>
       </w:pPr>
       <w:r>
-        <w:t xml:space="preserve">8. Frontend</w:t>
+        <w:t xml:space="preserve">8. Frontend y publicación</w:t>
       </w:r>
     </w:p>
     <w:p>
@@ -4346,7 +4346,34 @@
         <w:t xml:space="preserve">ORIGEN_PERMITIDO</w:t>
       </w:r>
       <w:r>
-        <w:t xml:space="preserve">).</w:t>
+        <w:t xml:space="preserve">). Con</w:t>
+      </w:r>
+      <w:r>
+        <w:t xml:space="preserve"> </w:t>
+      </w:r>
+      <w:r>
+        <w:rPr>
+          <w:rStyle w:val="VerbatimChar"/>
+        </w:rPr>
+        <w:t xml:space="preserve">npm run dev</w:t>
+      </w:r>
+      <w:r>
+        <w:t xml:space="preserve"> </w:t>
+      </w:r>
+      <w:r>
+        <w:t xml:space="preserve">corriendo, el backend también entrega el frontend en</w:t>
+      </w:r>
+      <w:r>
+        <w:t xml:space="preserve"> </w:t>
+      </w:r>
+      <w:r>
+        <w:rPr>
+          <w:rStyle w:val="VerbatimChar"/>
+        </w:rPr>
+        <w:t xml:space="preserve">http://localhost:3000</w:t>
+      </w:r>
+      <w:r>
+        <w:t xml:space="preserve">.</w:t>
       </w:r>
     </w:p>
     <w:p>
@@ -4354,7 +4381,7 @@
         <w:pStyle w:val="BodyText"/>
       </w:pPr>
       <w:r>
-        <w:t xml:space="preserve">La dirección de la API se configura en</w:t>
+        <w:t xml:space="preserve">La dirección de la API está en</w:t>
       </w:r>
       <w:r>
         <w:t xml:space="preserve"> </w:t>
@@ -4366,100 +4393,224 @@
         <w:t xml:space="preserve">frontend/js/config.js</w:t>
       </w:r>
       <w:r>
-        <w:t xml:space="preserve">:</w:t>
-      </w:r>
-    </w:p>
-    <w:p>
-      <w:pPr>
-        <w:pStyle w:val="SourceCode"/>
-      </w:pPr>
-      <w:r>
-        <w:rPr>
-          <w:rStyle w:val="KeywordTok"/>
-        </w:rPr>
-        <w:t xml:space="preserve">const</w:t>
-      </w:r>
-      <w:r>
-        <w:rPr>
-          <w:rStyle w:val="NormalTok"/>
-        </w:rPr>
-        <w:t xml:space="preserve"> CONFIG </w:t>
-      </w:r>
-      <w:r>
-        <w:rPr>
-          <w:rStyle w:val="OperatorTok"/>
-        </w:rPr>
-        <w:t xml:space="preserve">=</w:t>
-      </w:r>
-      <w:r>
-        <w:rPr>
-          <w:rStyle w:val="NormalTok"/>
-        </w:rPr>
-        <w:t xml:space="preserve"> { </w:t>
-      </w:r>
-      <w:r>
-        <w:rPr>
-          <w:rStyle w:val="DataTypeTok"/>
-        </w:rPr>
-        <w:t xml:space="preserve">API</w:t>
-      </w:r>
-      <w:r>
-        <w:rPr>
-          <w:rStyle w:val="OperatorTok"/>
-        </w:rPr>
-        <w:t xml:space="preserve">:</w:t>
-      </w:r>
-      <w:r>
-        <w:rPr>
-          <w:rStyle w:val="NormalTok"/>
-        </w:rPr>
-        <w:t xml:space="preserve"> </w:t>
-      </w:r>
-      <w:r>
-        <w:rPr>
-          <w:rStyle w:val="StringTok"/>
-        </w:rPr>
-        <w:t xml:space="preserve">'http://localhost:3000/api'</w:t>
-      </w:r>
-      <w:r>
-        <w:rPr>
-          <w:rStyle w:val="NormalTok"/>
-        </w:rPr>
-        <w:t xml:space="preserve"> }</w:t>
-      </w:r>
-      <w:r>
-        <w:rPr>
-          <w:rStyle w:val="OperatorTok"/>
-        </w:rPr>
-        <w:t xml:space="preserve">;</w:t>
+        <w:t xml:space="preserve"> </w:t>
+      </w:r>
+      <w:r>
+        <w:t xml:space="preserve">y no hay que cambiarla: si la página se abre desde el puerto 5500 (Live Server) usa</w:t>
+      </w:r>
+      <w:r>
+        <w:t xml:space="preserve"> </w:t>
+      </w:r>
+      <w:r>
+        <w:rPr>
+          <w:rStyle w:val="VerbatimChar"/>
+        </w:rPr>
+        <w:t xml:space="preserve">http://localhost:3000/api</w:t>
+      </w:r>
+      <w:r>
+        <w:t xml:space="preserve">; en cualquier otro caso usa</w:t>
+      </w:r>
+      <w:r>
+        <w:t xml:space="preserve"> </w:t>
+      </w:r>
+      <w:r>
+        <w:rPr>
+          <w:rStyle w:val="VerbatimChar"/>
+        </w:rPr>
+        <w:t xml:space="preserve">/api</w:t>
+      </w:r>
+      <w:r>
+        <w:t xml:space="preserve">, en el mismo dominio.</w:t>
+      </w:r>
+    </w:p>
+    <w:bookmarkStart w:id="36" w:name="cómo-se-publica"/>
+    <w:p>
+      <w:pPr>
+        <w:pStyle w:val="Heading3"/>
+      </w:pPr>
+      <w:r>
+        <w:t xml:space="preserve">8.1 Cómo se publica</w:t>
       </w:r>
     </w:p>
     <w:p>
       <w:pPr>
         <w:pStyle w:val="FirstParagraph"/>
       </w:pPr>
+      <w:r>
+        <w:t xml:space="preserve">Un solo servicio: Express atiende la API en</w:t>
+      </w:r>
+      <w:r>
+        <w:t xml:space="preserve"> </w:t>
+      </w:r>
+      <w:r>
+        <w:rPr>
+          <w:rStyle w:val="VerbatimChar"/>
+        </w:rPr>
+        <w:t xml:space="preserve">/api</w:t>
+      </w:r>
+      <w:r>
+        <w:t xml:space="preserve"> </w:t>
+      </w:r>
+      <w:r>
+        <w:t xml:space="preserve">y entrega la carpeta</w:t>
+      </w:r>
+      <w:r>
+        <w:t xml:space="preserve"> </w:t>
+      </w:r>
+      <w:r>
+        <w:rPr>
+          <w:rStyle w:val="VerbatimChar"/>
+        </w:rPr>
+        <w:t xml:space="preserve">frontend/</w:t>
+      </w:r>
+      <w:r>
+        <w:t xml:space="preserve"> </w:t>
+      </w:r>
+      <w:r>
+        <w:t xml:space="preserve">en el resto de rutas (</w:t>
+      </w:r>
+      <w:r>
+        <w:rPr>
+          <w:rStyle w:val="VerbatimChar"/>
+        </w:rPr>
+        <w:t xml:space="preserve">SERVIR_FRONTEND=true</w:t>
+      </w:r>
+      <w:r>
+        <w:t xml:space="preserve">, valor por defecto). Así hay un solo dominio con HTTPS y no hace falta CORS. El</w:t>
+      </w:r>
+      <w:r>
+        <w:t xml:space="preserve"> </w:t>
+      </w:r>
+      <w:r>
+        <w:rPr>
+          <w:rStyle w:val="VerbatimChar"/>
+        </w:rPr>
+        <w:t xml:space="preserve">package.json</w:t>
+      </w:r>
+      <w:r>
+        <w:t xml:space="preserve"> </w:t>
+      </w:r>
+      <w:r>
+        <w:t xml:space="preserve">de la raíz del repositorio instala el backend (</w:t>
+      </w:r>
+      <w:r>
+        <w:rPr>
+          <w:rStyle w:val="VerbatimChar"/>
+        </w:rPr>
+        <w:t xml:space="preserve">postinstall</w:t>
+      </w:r>
+      <w:r>
+        <w:t xml:space="preserve">) y lo arranca (</w:t>
+      </w:r>
+      <w:r>
+        <w:rPr>
+          <w:rStyle w:val="VerbatimChar"/>
+        </w:rPr>
+        <w:t xml:space="preserve">npm start</w:t>
+      </w:r>
+      <w:r>
+        <w:t xml:space="preserve">), para que el proveedor pueda construir desde la raíz.</w:t>
+      </w:r>
+    </w:p>
+    <w:p>
+      <w:pPr>
+        <w:pStyle w:val="BodyText"/>
+      </w:pPr>
+      <w:r>
+        <w:t xml:space="preserve">Requisitos de cualquier servidor: Node.js 20 o superior, MySQL 8 accesible desde el backend, HTTPS, proceso siempre encendido (los recordatorios se revisan cada 30 minutos dentro del mismo proceso, así que no sirven planes que apagan el servicio cuando no hay visitas) y las variables de entorno en el panel del proveedor, no en archivos.</w:t>
+      </w:r>
+    </w:p>
+    <w:bookmarkEnd w:id="36"/>
+    <w:bookmarkStart w:id="37" w:name="X42dbc7a02613852572f68cc5b8f7362f378a7e4"/>
+    <w:p>
+      <w:pPr>
+        <w:pStyle w:val="Heading3"/>
+      </w:pPr>
+      <w:r>
+        <w:t xml:space="preserve">8.2 Publicación en Railway (opción recomendada)</w:t>
+      </w:r>
+    </w:p>
+    <w:p>
+      <w:pPr>
+        <w:pStyle w:val="FirstParagraph"/>
+      </w:pPr>
+      <w:r>
+        <w:t xml:space="preserve">Plan</w:t>
+      </w:r>
+      <w:r>
+        <w:t xml:space="preserve"> </w:t>
+      </w:r>
       <w:r>
         <w:rPr>
           <w:bCs/>
           <w:b/>
         </w:rPr>
-        <w:t xml:space="preserve">Publicación en servidor:</w:t>
-      </w:r>
-      <w:r>
-        <w:t xml:space="preserve"> </w:t>
-      </w:r>
-      <w:r>
-        <w:rPr>
-          <w:iCs/>
-          <w:i/>
-        </w:rPr>
-        <w:t xml:space="preserve">pendiente de definir el proveedor.</w:t>
-      </w:r>
-      <w:r>
-        <w:t xml:space="preserve"> </w:t>
-      </w:r>
-      <w:r>
-        <w:t xml:space="preserve">La opción más simple es servir</w:t>
+        <w:t xml:space="preserve">Hobby</w:t>
+      </w:r>
+      <w:r>
+        <w:t xml:space="preserve">: USD 5 al mes, que incluyen USD 5 de consumo; una app pequeña con su base de datos suele quedar en ese rango. El plan gratuito no alcanza porque después de la prueba solo permite un servicio por proyecto, y aquí son dos (la app y MySQL).</w:t>
+      </w:r>
+    </w:p>
+    <w:p>
+      <w:pPr>
+        <w:numPr>
+          <w:ilvl w:val="0"/>
+          <w:numId w:val="1002"/>
+        </w:numPr>
+      </w:pPr>
+      <w:r>
+        <w:t xml:space="preserve">Entrar a railway.com con la cuenta de GitHub del repositorio y activar el plan Hobby.</w:t>
+      </w:r>
+    </w:p>
+    <w:p>
+      <w:pPr>
+        <w:numPr>
+          <w:ilvl w:val="0"/>
+          <w:numId w:val="1002"/>
+        </w:numPr>
+      </w:pPr>
+      <w:r>
+        <w:rPr>
+          <w:bCs/>
+          <w:b/>
+        </w:rPr>
+        <w:t xml:space="preserve">New Project → Deploy from GitHub repo →</w:t>
+      </w:r>
+      <w:r>
+        <w:t xml:space="preserve"> </w:t>
+      </w:r>
+      <w:r>
+        <w:rPr>
+          <w:rStyle w:val="VerbatimChar"/>
+        </w:rPr>
+        <w:t xml:space="preserve">arte-odontologico</w:t>
+      </w:r>
+      <w:r>
+        <w:t xml:space="preserve">, rama</w:t>
+      </w:r>
+      <w:r>
+        <w:t xml:space="preserve"> </w:t>
+      </w:r>
+      <w:r>
+        <w:rPr>
+          <w:rStyle w:val="VerbatimChar"/>
+        </w:rPr>
+        <w:t xml:space="preserve">main</w:t>
+      </w:r>
+      <w:r>
+        <w:t xml:space="preserve">. Directorio raíz: la raíz del repositorio (no</w:t>
+      </w:r>
+      <w:r>
+        <w:t xml:space="preserve"> </w:t>
+      </w:r>
+      <w:r>
+        <w:rPr>
+          <w:rStyle w:val="VerbatimChar"/>
+        </w:rPr>
+        <w:t xml:space="preserve">backend/</w:t>
+      </w:r>
+      <w:r>
+        <w:t xml:space="preserve">, porque el servidor también necesita</w:t>
       </w:r>
       <w:r>
         <w:t xml:space="preserve"> </w:t>
@@ -4471,19 +4622,812 @@
         <w:t xml:space="preserve">frontend/</w:t>
       </w:r>
       <w:r>
-        <w:t xml:space="preserve"> </w:t>
-      </w:r>
-      <w:r>
-        <w:t xml:space="preserve">desde el mismo Express (un solo despliegue, sin CORS). Requisitos mínimos de la publicación: HTTPS, base de datos MySQL 8 accesible desde el backend, variables de entorno configuradas en el panel del proveedor (no en archivos),</w:t>
-      </w:r>
-      <w:r>
-        <w:t xml:space="preserve"> </w:t>
-      </w:r>
-      <w:r>
-        <w:rPr>
-          <w:rStyle w:val="VerbatimChar"/>
-        </w:rPr>
-        <w:t xml:space="preserve">PROXY_CONFIABLE=1</w:t>
+        <w:t xml:space="preserve">).</w:t>
+      </w:r>
+    </w:p>
+    <w:p>
+      <w:pPr>
+        <w:numPr>
+          <w:ilvl w:val="0"/>
+          <w:numId w:val="1002"/>
+        </w:numPr>
+      </w:pPr>
+      <w:r>
+        <w:t xml:space="preserve">En el mismo proyecto:</w:t>
+      </w:r>
+      <w:r>
+        <w:t xml:space="preserve"> </w:t>
+      </w:r>
+      <w:r>
+        <w:rPr>
+          <w:bCs/>
+          <w:b/>
+        </w:rPr>
+        <w:t xml:space="preserve">+ New → Database → MySQL</w:t>
+      </w:r>
+      <w:r>
+        <w:t xml:space="preserve">.</w:t>
+      </w:r>
+    </w:p>
+    <w:p>
+      <w:pPr>
+        <w:numPr>
+          <w:ilvl w:val="0"/>
+          <w:numId w:val="1002"/>
+        </w:numPr>
+      </w:pPr>
+      <w:r>
+        <w:t xml:space="preserve">En el servicio de la app, pestaña</w:t>
+      </w:r>
+      <w:r>
+        <w:t xml:space="preserve"> </w:t>
+      </w:r>
+      <w:r>
+        <w:rPr>
+          <w:bCs/>
+          <w:b/>
+        </w:rPr>
+        <w:t xml:space="preserve">Variables</w:t>
+      </w:r>
+      <w:r>
+        <w:t xml:space="preserve">, crear (las que van entre</w:t>
+      </w:r>
+      <w:r>
+        <w:t xml:space="preserve"> </w:t>
+      </w:r>
+      <w:r>
+        <w:rPr>
+          <w:rStyle w:val="VerbatimChar"/>
+        </w:rPr>
+        <w:t xml:space="preserve">${{ }}</w:t>
+      </w:r>
+      <w:r>
+        <w:t xml:space="preserve"> </w:t>
+      </w:r>
+      <w:r>
+        <w:t xml:space="preserve">son referencias a la base de datos que Railway completa solo):</w:t>
+      </w:r>
+    </w:p>
+    <w:tbl>
+      <w:tblPr>
+        <w:tblStyle w:val="Table"/>
+        <w:tblW w:type="pct" w:w="5000"/>
+        <w:tblLook w:firstRow="1" w:lastRow="0" w:firstColumn="0" w:lastColumn="0" w:noHBand="0" w:noVBand="0" w:val="0020"/>
+        <w:jc w:val="start"/>
+        <w:tblInd w:w="720" w:type="dxa"/>
+      </w:tblPr>
+      <w:tblGrid>
+        <w:gridCol w:w="3960"/>
+        <w:gridCol w:w="3960"/>
+      </w:tblGrid>
+      <w:tr>
+        <w:trPr>
+          <w:tblHeader w:val="true"/>
+        </w:trPr>
+        <w:tc>
+          <w:tcPr/>
+          <w:p>
+            <w:pPr>
+              <w:pStyle w:val="Compact"/>
+              <w:jc w:val="left"/>
+            </w:pPr>
+            <w:r>
+              <w:t xml:space="preserve">Variable</w:t>
+            </w:r>
+          </w:p>
+        </w:tc>
+        <w:tc>
+          <w:tcPr/>
+          <w:p>
+            <w:pPr>
+              <w:pStyle w:val="Compact"/>
+              <w:jc w:val="left"/>
+            </w:pPr>
+            <w:r>
+              <w:t xml:space="preserve">Valor</w:t>
+            </w:r>
+          </w:p>
+        </w:tc>
+      </w:tr>
+      <w:tr>
+        <w:tc>
+          <w:tcPr/>
+          <w:p>
+            <w:pPr>
+              <w:pStyle w:val="Compact"/>
+              <w:jc w:val="left"/>
+            </w:pPr>
+            <w:r>
+              <w:rPr>
+                <w:rStyle w:val="VerbatimChar"/>
+              </w:rPr>
+              <w:t xml:space="preserve">DB_HOST</w:t>
+            </w:r>
+          </w:p>
+        </w:tc>
+        <w:tc>
+          <w:tcPr/>
+          <w:p>
+            <w:pPr>
+              <w:pStyle w:val="Compact"/>
+              <w:jc w:val="left"/>
+            </w:pPr>
+            <w:r>
+              <w:rPr>
+                <w:rStyle w:val="VerbatimChar"/>
+              </w:rPr>
+              <w:t xml:space="preserve">${{MySQL.MYSQLHOST}}</w:t>
+            </w:r>
+          </w:p>
+        </w:tc>
+      </w:tr>
+      <w:tr>
+        <w:tc>
+          <w:tcPr/>
+          <w:p>
+            <w:pPr>
+              <w:pStyle w:val="Compact"/>
+              <w:jc w:val="left"/>
+            </w:pPr>
+            <w:r>
+              <w:rPr>
+                <w:rStyle w:val="VerbatimChar"/>
+              </w:rPr>
+              <w:t xml:space="preserve">DB_PORT</w:t>
+            </w:r>
+          </w:p>
+        </w:tc>
+        <w:tc>
+          <w:tcPr/>
+          <w:p>
+            <w:pPr>
+              <w:pStyle w:val="Compact"/>
+              <w:jc w:val="left"/>
+            </w:pPr>
+            <w:r>
+              <w:rPr>
+                <w:rStyle w:val="VerbatimChar"/>
+              </w:rPr>
+              <w:t xml:space="preserve">${{MySQL.MYSQLPORT}}</w:t>
+            </w:r>
+          </w:p>
+        </w:tc>
+      </w:tr>
+      <w:tr>
+        <w:tc>
+          <w:tcPr/>
+          <w:p>
+            <w:pPr>
+              <w:pStyle w:val="Compact"/>
+              <w:jc w:val="left"/>
+            </w:pPr>
+            <w:r>
+              <w:rPr>
+                <w:rStyle w:val="VerbatimChar"/>
+              </w:rPr>
+              <w:t xml:space="preserve">DB_USER</w:t>
+            </w:r>
+          </w:p>
+        </w:tc>
+        <w:tc>
+          <w:tcPr/>
+          <w:p>
+            <w:pPr>
+              <w:pStyle w:val="Compact"/>
+              <w:jc w:val="left"/>
+            </w:pPr>
+            <w:r>
+              <w:rPr>
+                <w:rStyle w:val="VerbatimChar"/>
+              </w:rPr>
+              <w:t xml:space="preserve">${{MySQL.MYSQLUSER}}</w:t>
+            </w:r>
+          </w:p>
+        </w:tc>
+      </w:tr>
+      <w:tr>
+        <w:tc>
+          <w:tcPr/>
+          <w:p>
+            <w:pPr>
+              <w:pStyle w:val="Compact"/>
+              <w:jc w:val="left"/>
+            </w:pPr>
+            <w:r>
+              <w:rPr>
+                <w:rStyle w:val="VerbatimChar"/>
+              </w:rPr>
+              <w:t xml:space="preserve">DB_PASSWORD</w:t>
+            </w:r>
+          </w:p>
+        </w:tc>
+        <w:tc>
+          <w:tcPr/>
+          <w:p>
+            <w:pPr>
+              <w:pStyle w:val="Compact"/>
+              <w:jc w:val="left"/>
+            </w:pPr>
+            <w:r>
+              <w:rPr>
+                <w:rStyle w:val="VerbatimChar"/>
+              </w:rPr>
+              <w:t xml:space="preserve">${{MySQL.MYSQLPASSWORD}}</w:t>
+            </w:r>
+          </w:p>
+        </w:tc>
+      </w:tr>
+      <w:tr>
+        <w:tc>
+          <w:tcPr/>
+          <w:p>
+            <w:pPr>
+              <w:pStyle w:val="Compact"/>
+              <w:jc w:val="left"/>
+            </w:pPr>
+            <w:r>
+              <w:rPr>
+                <w:rStyle w:val="VerbatimChar"/>
+              </w:rPr>
+              <w:t xml:space="preserve">DB_NAME</w:t>
+            </w:r>
+          </w:p>
+        </w:tc>
+        <w:tc>
+          <w:tcPr/>
+          <w:p>
+            <w:pPr>
+              <w:pStyle w:val="Compact"/>
+              <w:jc w:val="left"/>
+            </w:pPr>
+            <w:r>
+              <w:rPr>
+                <w:rStyle w:val="VerbatimChar"/>
+              </w:rPr>
+              <w:t xml:space="preserve">arte_odontologico</w:t>
+            </w:r>
+          </w:p>
+        </w:tc>
+      </w:tr>
+      <w:tr>
+        <w:tc>
+          <w:tcPr/>
+          <w:p>
+            <w:pPr>
+              <w:pStyle w:val="Compact"/>
+              <w:jc w:val="left"/>
+            </w:pPr>
+            <w:r>
+              <w:rPr>
+                <w:rStyle w:val="VerbatimChar"/>
+              </w:rPr>
+              <w:t xml:space="preserve">JWT_SECRET</w:t>
+            </w:r>
+          </w:p>
+        </w:tc>
+        <w:tc>
+          <w:tcPr/>
+          <w:p>
+            <w:pPr>
+              <w:pStyle w:val="Compact"/>
+              <w:jc w:val="left"/>
+            </w:pPr>
+            <w:r>
+              <w:t xml:space="preserve">una clave nueva y larga (ver sección 6), distinta a la de desarrollo</w:t>
+            </w:r>
+          </w:p>
+        </w:tc>
+      </w:tr>
+      <w:tr>
+        <w:tc>
+          <w:tcPr/>
+          <w:p>
+            <w:pPr>
+              <w:pStyle w:val="Compact"/>
+              <w:jc w:val="left"/>
+            </w:pPr>
+            <w:r>
+              <w:rPr>
+                <w:rStyle w:val="VerbatimChar"/>
+              </w:rPr>
+              <w:t xml:space="preserve">PROXY_CONFIABLE</w:t>
+            </w:r>
+          </w:p>
+        </w:tc>
+        <w:tc>
+          <w:tcPr/>
+          <w:p>
+            <w:pPr>
+              <w:pStyle w:val="Compact"/>
+              <w:jc w:val="left"/>
+            </w:pPr>
+            <w:r>
+              <w:rPr>
+                <w:rStyle w:val="VerbatimChar"/>
+              </w:rPr>
+              <w:t xml:space="preserve">1</w:t>
+            </w:r>
+          </w:p>
+        </w:tc>
+      </w:tr>
+      <w:tr>
+        <w:tc>
+          <w:tcPr/>
+          <w:p>
+            <w:pPr>
+              <w:pStyle w:val="Compact"/>
+              <w:jc w:val="left"/>
+            </w:pPr>
+            <w:r>
+              <w:rPr>
+                <w:rStyle w:val="VerbatimChar"/>
+              </w:rPr>
+              <w:t xml:space="preserve">URL_PUBLICA</w:t>
+            </w:r>
+          </w:p>
+        </w:tc>
+        <w:tc>
+          <w:tcPr/>
+          <w:p>
+            <w:pPr>
+              <w:pStyle w:val="Compact"/>
+              <w:jc w:val="left"/>
+            </w:pPr>
+            <w:r>
+              <w:t xml:space="preserve">el dominio público del paso 6, con</w:t>
+            </w:r>
+            <w:r>
+              <w:t xml:space="preserve"> </w:t>
+            </w:r>
+            <w:r>
+              <w:rPr>
+                <w:rStyle w:val="VerbatimChar"/>
+              </w:rPr>
+              <w:t xml:space="preserve">https://</w:t>
+            </w:r>
+          </w:p>
+        </w:tc>
+      </w:tr>
+      <w:tr>
+        <w:tc>
+          <w:tcPr/>
+          <w:p>
+            <w:pPr>
+              <w:pStyle w:val="Compact"/>
+              <w:jc w:val="left"/>
+            </w:pPr>
+            <w:r>
+              <w:rPr>
+                <w:rStyle w:val="VerbatimChar"/>
+              </w:rPr>
+              <w:t xml:space="preserve">WHATSAPP_MODO</w:t>
+            </w:r>
+            <w:r>
+              <w:t xml:space="preserve"> </w:t>
+            </w:r>
+            <w:r>
+              <w:t xml:space="preserve">y sus datos</w:t>
+            </w:r>
+          </w:p>
+        </w:tc>
+        <w:tc>
+          <w:tcPr/>
+          <w:p>
+            <w:pPr>
+              <w:pStyle w:val="Compact"/>
+              <w:jc w:val="left"/>
+            </w:pPr>
+            <w:r>
+              <w:t xml:space="preserve">como en la sección 7 (en producción,</w:t>
+            </w:r>
+            <w:r>
+              <w:t xml:space="preserve"> </w:t>
+            </w:r>
+            <w:r>
+              <w:rPr>
+                <w:rStyle w:val="VerbatimChar"/>
+              </w:rPr>
+              <w:t xml:space="preserve">api</w:t>
+            </w:r>
+            <w:r>
+              <w:t xml:space="preserve"> </w:t>
+            </w:r>
+            <w:r>
+              <w:t xml:space="preserve">con las plantillas aprobadas, o</w:t>
+            </w:r>
+            <w:r>
+              <w:t xml:space="preserve"> </w:t>
+            </w:r>
+            <w:r>
+              <w:rPr>
+                <w:rStyle w:val="VerbatimChar"/>
+              </w:rPr>
+              <w:t xml:space="preserve">manual</w:t>
+            </w:r>
+            <w:r>
+              <w:t xml:space="preserve"> </w:t>
+            </w:r>
+            <w:r>
+              <w:t xml:space="preserve">mientras tanto)</w:t>
+            </w:r>
+          </w:p>
+        </w:tc>
+      </w:tr>
+    </w:tbl>
+    <w:p>
+      <w:pPr>
+        <w:numPr>
+          <w:ilvl w:val="0"/>
+          <w:numId w:val="1000"/>
+        </w:numPr>
+      </w:pPr>
+      <w:r>
+        <w:t xml:space="preserve">El resto (</w:t>
+      </w:r>
+      <w:r>
+        <w:rPr>
+          <w:rStyle w:val="VerbatimChar"/>
+        </w:rPr>
+        <w:t xml:space="preserve">HORAS_MINIMAS_GESTION</w:t>
+      </w:r>
+      <w:r>
+        <w:t xml:space="preserve">, límites, recordatorios) puede quedar con los valores por defecto.</w:t>
+      </w:r>
+    </w:p>
+    <w:p>
+      <w:pPr>
+        <w:numPr>
+          <w:ilvl w:val="0"/>
+          <w:numId w:val="1002"/>
+        </w:numPr>
+      </w:pPr>
+      <w:r>
+        <w:rPr>
+          <w:bCs/>
+          <w:b/>
+        </w:rPr>
+        <w:t xml:space="preserve">Crear las tablas.</w:t>
+      </w:r>
+      <w:r>
+        <w:t xml:space="preserve"> </w:t>
+      </w:r>
+      <w:r>
+        <w:t xml:space="preserve">En el servicio MySQL →</w:t>
+      </w:r>
+      <w:r>
+        <w:t xml:space="preserve"> </w:t>
+      </w:r>
+      <w:r>
+        <w:rPr>
+          <w:bCs/>
+          <w:b/>
+        </w:rPr>
+        <w:t xml:space="preserve">Connect → Public network</w:t>
+      </w:r>
+      <w:r>
+        <w:t xml:space="preserve"> </w:t>
+      </w:r>
+      <w:r>
+        <w:t xml:space="preserve">aparecen el host y el puerto públicos. Desde el PC, con MySQL Workbench o con la consola:</w:t>
+      </w:r>
+    </w:p>
+    <w:p>
+      <w:pPr>
+        <w:numPr>
+          <w:ilvl w:val="0"/>
+          <w:numId w:val="1000"/>
+        </w:numPr>
+        <w:pStyle w:val="SourceCode"/>
+      </w:pPr>
+      <w:r>
+        <w:rPr>
+          <w:rStyle w:val="OperatorTok"/>
+        </w:rPr>
+        <w:t xml:space="preserve">&amp;</w:t>
+      </w:r>
+      <w:r>
+        <w:rPr>
+          <w:rStyle w:val="NormalTok"/>
+        </w:rPr>
+        <w:t xml:space="preserve"> </w:t>
+      </w:r>
+      <w:r>
+        <w:rPr>
+          <w:rStyle w:val="StringTok"/>
+        </w:rPr>
+        <w:t xml:space="preserve">"$bin\mysql.exe"</w:t>
+      </w:r>
+      <w:r>
+        <w:rPr>
+          <w:rStyle w:val="NormalTok"/>
+        </w:rPr>
+        <w:t xml:space="preserve"> </w:t>
+      </w:r>
+      <w:r>
+        <w:rPr>
+          <w:rStyle w:val="OperatorTok"/>
+        </w:rPr>
+        <w:t xml:space="preserve">-</w:t>
+      </w:r>
+      <w:r>
+        <w:rPr>
+          <w:rStyle w:val="NormalTok"/>
+        </w:rPr>
+        <w:t xml:space="preserve">h HOST_PUBLICO </w:t>
+      </w:r>
+      <w:r>
+        <w:rPr>
+          <w:rStyle w:val="OperatorTok"/>
+        </w:rPr>
+        <w:t xml:space="preserve">-</w:t>
+      </w:r>
+      <w:r>
+        <w:rPr>
+          <w:rStyle w:val="NormalTok"/>
+        </w:rPr>
+        <w:t xml:space="preserve">P PUERTO_PUBLICO </w:t>
+      </w:r>
+      <w:r>
+        <w:rPr>
+          <w:rStyle w:val="OperatorTok"/>
+        </w:rPr>
+        <w:t xml:space="preserve">-</w:t>
+      </w:r>
+      <w:r>
+        <w:rPr>
+          <w:rStyle w:val="NormalTok"/>
+        </w:rPr>
+        <w:t xml:space="preserve">u root </w:t>
+      </w:r>
+      <w:r>
+        <w:rPr>
+          <w:rStyle w:val="OperatorTok"/>
+        </w:rPr>
+        <w:t xml:space="preserve">-</w:t>
+      </w:r>
+      <w:r>
+        <w:rPr>
+          <w:rStyle w:val="NormalTok"/>
+        </w:rPr>
+        <w:t xml:space="preserve">p </w:t>
+      </w:r>
+      <w:r>
+        <w:rPr>
+          <w:rStyle w:val="OperatorTok"/>
+        </w:rPr>
+        <w:t xml:space="preserve">-</w:t>
+      </w:r>
+      <w:r>
+        <w:rPr>
+          <w:rStyle w:val="NormalTok"/>
+        </w:rPr>
+        <w:t xml:space="preserve">e </w:t>
+      </w:r>
+      <w:r>
+        <w:rPr>
+          <w:rStyle w:val="StringTok"/>
+        </w:rPr>
+        <w:t xml:space="preserve">"source backend/database/schema.sql"</w:t>
+      </w:r>
+    </w:p>
+    <w:p>
+      <w:pPr>
+        <w:numPr>
+          <w:ilvl w:val="0"/>
+          <w:numId w:val="1000"/>
+        </w:numPr>
+      </w:pPr>
+      <w:r>
+        <w:rPr>
+          <w:rStyle w:val="VerbatimChar"/>
+        </w:rPr>
+        <w:t xml:space="preserve">schema.sql</w:t>
+      </w:r>
+      <w:r>
+        <w:t xml:space="preserve"> </w:t>
+      </w:r>
+      <w:r>
+        <w:t xml:space="preserve">crea la base</w:t>
+      </w:r>
+      <w:r>
+        <w:t xml:space="preserve"> </w:t>
+      </w:r>
+      <w:r>
+        <w:rPr>
+          <w:rStyle w:val="VerbatimChar"/>
+        </w:rPr>
+        <w:t xml:space="preserve">arte_odontologico</w:t>
+      </w:r>
+      <w:r>
+        <w:t xml:space="preserve"> </w:t>
+      </w:r>
+      <w:r>
+        <w:t xml:space="preserve">con todas las tablas hasta la migración 005 y el catálogo inicial.</w:t>
+      </w:r>
+    </w:p>
+    <w:p>
+      <w:pPr>
+        <w:numPr>
+          <w:ilvl w:val="0"/>
+          <w:numId w:val="1002"/>
+        </w:numPr>
+      </w:pPr>
+      <w:r>
+        <w:rPr>
+          <w:bCs/>
+          <w:b/>
+        </w:rPr>
+        <w:t xml:space="preserve">Dominio:</w:t>
+      </w:r>
+      <w:r>
+        <w:t xml:space="preserve"> </w:t>
+      </w:r>
+      <w:r>
+        <w:t xml:space="preserve">en el servicio de la app →</w:t>
+      </w:r>
+      <w:r>
+        <w:t xml:space="preserve"> </w:t>
+      </w:r>
+      <w:r>
+        <w:rPr>
+          <w:bCs/>
+          <w:b/>
+        </w:rPr>
+        <w:t xml:space="preserve">Settings → Networking → Generate Domain</w:t>
+      </w:r>
+      <w:r>
+        <w:t xml:space="preserve"> </w:t>
+      </w:r>
+      <w:r>
+        <w:t xml:space="preserve">(queda algo como</w:t>
+      </w:r>
+      <w:r>
+        <w:t xml:space="preserve"> </w:t>
+      </w:r>
+      <w:r>
+        <w:rPr>
+          <w:rStyle w:val="VerbatimChar"/>
+        </w:rPr>
+        <w:t xml:space="preserve">arte-odontologico.up.railway.app</w:t>
+      </w:r>
+      <w:r>
+        <w:t xml:space="preserve">), o</w:t>
+      </w:r>
+      <w:r>
+        <w:t xml:space="preserve"> </w:t>
+      </w:r>
+      <w:r>
+        <w:rPr>
+          <w:bCs/>
+          <w:b/>
+        </w:rPr>
+        <w:t xml:space="preserve">Custom Domain</w:t>
+      </w:r>
+      <w:r>
+        <w:t xml:space="preserve"> </w:t>
+      </w:r>
+      <w:r>
+        <w:t xml:space="preserve">si el consultorio tiene uno. Copiarlo en</w:t>
+      </w:r>
+      <w:r>
+        <w:t xml:space="preserve"> </w:t>
+      </w:r>
+      <w:r>
+        <w:rPr>
+          <w:rStyle w:val="VerbatimChar"/>
+        </w:rPr>
+        <w:t xml:space="preserve">URL_PUBLICA</w:t>
+      </w:r>
+      <w:r>
+        <w:t xml:space="preserve">.</w:t>
+      </w:r>
+    </w:p>
+    <w:p>
+      <w:pPr>
+        <w:numPr>
+          <w:ilvl w:val="0"/>
+          <w:numId w:val="1002"/>
+        </w:numPr>
+      </w:pPr>
+      <w:r>
+        <w:rPr>
+          <w:bCs/>
+          <w:b/>
+        </w:rPr>
+        <w:t xml:space="preserve">Crear la cuenta de la secretaria</w:t>
+      </w:r>
+      <w:r>
+        <w:t xml:space="preserve"> </w:t>
+      </w:r>
+      <w:r>
+        <w:t xml:space="preserve">contra la base publicada. En</w:t>
+      </w:r>
+      <w:r>
+        <w:t xml:space="preserve"> </w:t>
+      </w:r>
+      <w:r>
+        <w:rPr>
+          <w:rStyle w:val="VerbatimChar"/>
+        </w:rPr>
+        <w:t xml:space="preserve">backend/</w:t>
+      </w:r>
+      <w:r>
+        <w:t xml:space="preserve">, crear un archivo</w:t>
+      </w:r>
+      <w:r>
+        <w:t xml:space="preserve"> </w:t>
+      </w:r>
+      <w:r>
+        <w:rPr>
+          <w:rStyle w:val="VerbatimChar"/>
+        </w:rPr>
+        <w:t xml:space="preserve">.env.railway</w:t>
+      </w:r>
+      <w:r>
+        <w:t xml:space="preserve"> </w:t>
+      </w:r>
+      <w:r>
+        <w:t xml:space="preserve">(no se sube:</w:t>
+      </w:r>
+      <w:r>
+        <w:t xml:space="preserve"> </w:t>
+      </w:r>
+      <w:r>
+        <w:rPr>
+          <w:rStyle w:val="VerbatimChar"/>
+        </w:rPr>
+        <w:t xml:space="preserve">.env.*</w:t>
+      </w:r>
+      <w:r>
+        <w:t xml:space="preserve"> </w:t>
+      </w:r>
+      <w:r>
+        <w:t xml:space="preserve">está en</w:t>
+      </w:r>
+      <w:r>
+        <w:t xml:space="preserve"> </w:t>
+      </w:r>
+      <w:r>
+        <w:rPr>
+          <w:rStyle w:val="VerbatimChar"/>
+        </w:rPr>
+        <w:t xml:space="preserve">.gitignore</w:t>
+      </w:r>
+      <w:r>
+        <w:t xml:space="preserve">) con</w:t>
+      </w:r>
+      <w:r>
+        <w:t xml:space="preserve"> </w:t>
+      </w:r>
+      <w:r>
+        <w:rPr>
+          <w:rStyle w:val="VerbatimChar"/>
+        </w:rPr>
+        <w:t xml:space="preserve">DB_HOST</w:t>
+      </w:r>
+      <w:r>
+        <w:t xml:space="preserve">,</w:t>
+      </w:r>
+      <w:r>
+        <w:t xml:space="preserve"> </w:t>
+      </w:r>
+      <w:r>
+        <w:rPr>
+          <w:rStyle w:val="VerbatimChar"/>
+        </w:rPr>
+        <w:t xml:space="preserve">DB_PORT</w:t>
+      </w:r>
+      <w:r>
+        <w:t xml:space="preserve">,</w:t>
+      </w:r>
+      <w:r>
+        <w:t xml:space="preserve"> </w:t>
+      </w:r>
+      <w:r>
+        <w:rPr>
+          <w:rStyle w:val="VerbatimChar"/>
+        </w:rPr>
+        <w:t xml:space="preserve">DB_USER</w:t>
       </w:r>
       <w:r>
         <w:t xml:space="preserve"> </w:t>
@@ -4498,17 +5442,437 @@
         <w:rPr>
           <w:rStyle w:val="VerbatimChar"/>
         </w:rPr>
-        <w:t xml:space="preserve">URL_PUBLICA</w:t>
-      </w:r>
-      <w:r>
-        <w:t xml:space="preserve"> </w:t>
-      </w:r>
-      <w:r>
-        <w:t xml:space="preserve">con el dominio real.</w:t>
-      </w:r>
-    </w:p>
-    <w:bookmarkEnd w:id="36"/>
-    <w:bookmarkStart w:id="37" w:name="verificación-rápida"/>
+        <w:t xml:space="preserve">DB_PASSWORD</w:t>
+      </w:r>
+      <w:r>
+        <w:t xml:space="preserve"> </w:t>
+      </w:r>
+      <w:r>
+        <w:t xml:space="preserve">públicos del paso 5 y</w:t>
+      </w:r>
+      <w:r>
+        <w:t xml:space="preserve"> </w:t>
+      </w:r>
+      <w:r>
+        <w:rPr>
+          <w:rStyle w:val="VerbatimChar"/>
+        </w:rPr>
+        <w:t xml:space="preserve">DB_NAME=arte_odontologico</w:t>
+      </w:r>
+      <w:r>
+        <w:t xml:space="preserve">, y ejecutar:</w:t>
+      </w:r>
+    </w:p>
+    <w:p>
+      <w:pPr>
+        <w:numPr>
+          <w:ilvl w:val="0"/>
+          <w:numId w:val="1000"/>
+        </w:numPr>
+        <w:pStyle w:val="SourceCode"/>
+      </w:pPr>
+      <w:r>
+        <w:rPr>
+          <w:rStyle w:val="NormalTok"/>
+        </w:rPr>
+        <w:t xml:space="preserve">node </w:t>
+      </w:r>
+      <w:r>
+        <w:rPr>
+          <w:rStyle w:val="OperatorTok"/>
+        </w:rPr>
+        <w:t xml:space="preserve">-</w:t>
+      </w:r>
+      <w:r>
+        <w:rPr>
+          <w:rStyle w:val="NormalTok"/>
+        </w:rPr>
+        <w:t xml:space="preserve">r dotenv</w:t>
+      </w:r>
+      <w:r>
+        <w:rPr>
+          <w:rStyle w:val="OperatorTok"/>
+        </w:rPr>
+        <w:t xml:space="preserve">/</w:t>
+      </w:r>
+      <w:r>
+        <w:rPr>
+          <w:rStyle w:val="NormalTok"/>
+        </w:rPr>
+        <w:t xml:space="preserve">config src</w:t>
+      </w:r>
+      <w:r>
+        <w:rPr>
+          <w:rStyle w:val="OperatorTok"/>
+        </w:rPr>
+        <w:t xml:space="preserve">/</w:t>
+      </w:r>
+      <w:r>
+        <w:rPr>
+          <w:rStyle w:val="NormalTok"/>
+        </w:rPr>
+        <w:t xml:space="preserve">scripts</w:t>
+      </w:r>
+      <w:r>
+        <w:rPr>
+          <w:rStyle w:val="OperatorTok"/>
+        </w:rPr>
+        <w:t xml:space="preserve">/</w:t>
+      </w:r>
+      <w:r>
+        <w:rPr>
+          <w:rStyle w:val="NormalTok"/>
+        </w:rPr>
+        <w:t xml:space="preserve">crearAdmin</w:t>
+      </w:r>
+      <w:r>
+        <w:rPr>
+          <w:rStyle w:val="OperatorTok"/>
+        </w:rPr>
+        <w:t xml:space="preserve">.</w:t>
+      </w:r>
+      <w:r>
+        <w:rPr>
+          <w:rStyle w:val="FunctionTok"/>
+        </w:rPr>
+        <w:t xml:space="preserve">js</w:t>
+      </w:r>
+      <w:r>
+        <w:rPr>
+          <w:rStyle w:val="NormalTok"/>
+        </w:rPr>
+        <w:t xml:space="preserve"> dotenv_config_path</w:t>
+      </w:r>
+      <w:r>
+        <w:rPr>
+          <w:rStyle w:val="OperatorTok"/>
+        </w:rPr>
+        <w:t xml:space="preserve">=.</w:t>
+      </w:r>
+      <w:r>
+        <w:rPr>
+          <w:rStyle w:val="FunctionTok"/>
+        </w:rPr>
+        <w:t xml:space="preserve">env</w:t>
+      </w:r>
+      <w:r>
+        <w:rPr>
+          <w:rStyle w:val="OperatorTok"/>
+        </w:rPr>
+        <w:t xml:space="preserve">.</w:t>
+      </w:r>
+      <w:r>
+        <w:rPr>
+          <w:rStyle w:val="FunctionTok"/>
+        </w:rPr>
+        <w:t xml:space="preserve">railway</w:t>
+      </w:r>
+    </w:p>
+    <w:p>
+      <w:pPr>
+        <w:numPr>
+          <w:ilvl w:val="0"/>
+          <w:numId w:val="1000"/>
+        </w:numPr>
+      </w:pPr>
+      <w:r>
+        <w:t xml:space="preserve">Borrar el archivo después.</w:t>
+      </w:r>
+    </w:p>
+    <w:p>
+      <w:pPr>
+        <w:numPr>
+          <w:ilvl w:val="0"/>
+          <w:numId w:val="1002"/>
+        </w:numPr>
+      </w:pPr>
+      <w:r>
+        <w:t xml:space="preserve">Verificar:</w:t>
+      </w:r>
+      <w:r>
+        <w:t xml:space="preserve"> </w:t>
+      </w:r>
+      <w:r>
+        <w:rPr>
+          <w:rStyle w:val="VerbatimChar"/>
+        </w:rPr>
+        <w:t xml:space="preserve">https://DOMINIO/api/salud</w:t>
+      </w:r>
+      <w:r>
+        <w:t xml:space="preserve"> </w:t>
+      </w:r>
+      <w:r>
+        <w:t xml:space="preserve">responde</w:t>
+      </w:r>
+      <w:r>
+        <w:t xml:space="preserve"> </w:t>
+      </w:r>
+      <w:r>
+        <w:rPr>
+          <w:rStyle w:val="VerbatimChar"/>
+        </w:rPr>
+        <w:t xml:space="preserve">{"estado":"ok"}</w:t>
+      </w:r>
+      <w:r>
+        <w:t xml:space="preserve">, la página principal carga, se puede pedir una cita y llega el WhatsApp con un enlace que abre</w:t>
+      </w:r>
+      <w:r>
+        <w:t xml:space="preserve"> </w:t>
+      </w:r>
+      <w:r>
+        <w:rPr>
+          <w:rStyle w:val="VerbatimChar"/>
+        </w:rPr>
+        <w:t xml:space="preserve">https://DOMINIO/gestionar-cita.html</w:t>
+      </w:r>
+      <w:r>
+        <w:t xml:space="preserve">.</w:t>
+      </w:r>
+    </w:p>
+    <w:p>
+      <w:pPr>
+        <w:pStyle w:val="FirstParagraph"/>
+      </w:pPr>
+      <w:r>
+        <w:t xml:space="preserve">Cada vez que se fusiona un PR en</w:t>
+      </w:r>
+      <w:r>
+        <w:t xml:space="preserve"> </w:t>
+      </w:r>
+      <w:r>
+        <w:rPr>
+          <w:rStyle w:val="VerbatimChar"/>
+        </w:rPr>
+        <w:t xml:space="preserve">main</w:t>
+      </w:r>
+      <w:r>
+        <w:t xml:space="preserve">, Railway vuelve a publicar solo. Si un cambio trae una migración nueva, se aplica antes con el mismo comando del paso 5 cambiando el archivo.</w:t>
+      </w:r>
+    </w:p>
+    <w:p>
+      <w:pPr>
+        <w:pStyle w:val="BodyText"/>
+      </w:pPr>
+      <w:r>
+        <w:rPr>
+          <w:bCs/>
+          <w:b/>
+        </w:rPr>
+        <w:t xml:space="preserve">Respaldos:</w:t>
+      </w:r>
+      <w:r>
+        <w:t xml:space="preserve"> </w:t>
+      </w:r>
+      <w:r>
+        <w:t xml:space="preserve">una vez por semana, y siempre antes de una migración:</w:t>
+      </w:r>
+    </w:p>
+    <w:p>
+      <w:pPr>
+        <w:pStyle w:val="SourceCode"/>
+      </w:pPr>
+      <w:r>
+        <w:rPr>
+          <w:rStyle w:val="OperatorTok"/>
+        </w:rPr>
+        <w:t xml:space="preserve">&amp;</w:t>
+      </w:r>
+      <w:r>
+        <w:rPr>
+          <w:rStyle w:val="NormalTok"/>
+        </w:rPr>
+        <w:t xml:space="preserve"> </w:t>
+      </w:r>
+      <w:r>
+        <w:rPr>
+          <w:rStyle w:val="StringTok"/>
+        </w:rPr>
+        <w:t xml:space="preserve">"$bin\mysqldump.exe"</w:t>
+      </w:r>
+      <w:r>
+        <w:rPr>
+          <w:rStyle w:val="NormalTok"/>
+        </w:rPr>
+        <w:t xml:space="preserve"> </w:t>
+      </w:r>
+      <w:r>
+        <w:rPr>
+          <w:rStyle w:val="OperatorTok"/>
+        </w:rPr>
+        <w:t xml:space="preserve">-</w:t>
+      </w:r>
+      <w:r>
+        <w:rPr>
+          <w:rStyle w:val="NormalTok"/>
+        </w:rPr>
+        <w:t xml:space="preserve">h HOST_PUBLICO </w:t>
+      </w:r>
+      <w:r>
+        <w:rPr>
+          <w:rStyle w:val="OperatorTok"/>
+        </w:rPr>
+        <w:t xml:space="preserve">-</w:t>
+      </w:r>
+      <w:r>
+        <w:rPr>
+          <w:rStyle w:val="NormalTok"/>
+        </w:rPr>
+        <w:t xml:space="preserve">P PUERTO_PUBLICO </w:t>
+      </w:r>
+      <w:r>
+        <w:rPr>
+          <w:rStyle w:val="OperatorTok"/>
+        </w:rPr>
+        <w:t xml:space="preserve">-</w:t>
+      </w:r>
+      <w:r>
+        <w:rPr>
+          <w:rStyle w:val="NormalTok"/>
+        </w:rPr>
+        <w:t xml:space="preserve">u root </w:t>
+      </w:r>
+      <w:r>
+        <w:rPr>
+          <w:rStyle w:val="OperatorTok"/>
+        </w:rPr>
+        <w:t xml:space="preserve">-</w:t>
+      </w:r>
+      <w:r>
+        <w:rPr>
+          <w:rStyle w:val="NormalTok"/>
+        </w:rPr>
+        <w:t xml:space="preserve">p </w:t>
+      </w:r>
+      <w:r>
+        <w:rPr>
+          <w:rStyle w:val="OperatorTok"/>
+        </w:rPr>
+        <w:t xml:space="preserve">--</w:t>
+      </w:r>
+      <w:r>
+        <w:rPr>
+          <w:rStyle w:val="NormalTok"/>
+        </w:rPr>
+        <w:t xml:space="preserve">result</w:t>
+      </w:r>
+      <w:r>
+        <w:rPr>
+          <w:rStyle w:val="OperatorTok"/>
+        </w:rPr>
+        <w:t xml:space="preserve">-</w:t>
+      </w:r>
+      <w:r>
+        <w:rPr>
+          <w:rStyle w:val="NormalTok"/>
+        </w:rPr>
+        <w:t xml:space="preserve">file</w:t>
+      </w:r>
+      <w:r>
+        <w:rPr>
+          <w:rStyle w:val="OperatorTok"/>
+        </w:rPr>
+        <w:t xml:space="preserve">=</w:t>
+      </w:r>
+      <w:r>
+        <w:rPr>
+          <w:rStyle w:val="StringTok"/>
+        </w:rPr>
+        <w:t xml:space="preserve">"respaldo-AAAA-MM-DD.sql"</w:t>
+      </w:r>
+      <w:r>
+        <w:rPr>
+          <w:rStyle w:val="NormalTok"/>
+        </w:rPr>
+        <w:t xml:space="preserve"> arte_odontologico</w:t>
+      </w:r>
+    </w:p>
+    <w:bookmarkEnd w:id="37"/>
+    <w:bookmarkStart w:id="38" w:name="otras-opciones"/>
+    <w:p>
+      <w:pPr>
+        <w:pStyle w:val="Heading3"/>
+      </w:pPr>
+      <w:r>
+        <w:t xml:space="preserve">8.3 Otras opciones</w:t>
+      </w:r>
+    </w:p>
+    <w:p>
+      <w:pPr>
+        <w:numPr>
+          <w:ilvl w:val="0"/>
+          <w:numId w:val="1003"/>
+        </w:numPr>
+        <w:pStyle w:val="Compact"/>
+      </w:pPr>
+      <w:r>
+        <w:rPr>
+          <w:bCs/>
+          <w:b/>
+        </w:rPr>
+        <w:t xml:space="preserve">AWS Lightsail (instancia con Node.js):</w:t>
+      </w:r>
+      <w:r>
+        <w:t xml:space="preserve"> </w:t>
+      </w:r>
+      <w:r>
+        <w:t xml:space="preserve">precio fijo mensual y control total, pero hay que instalar MySQL, Nginx y el certificado HTTPS y mantener el servidor a mano. Con la misma estructura:</w:t>
+      </w:r>
+      <w:r>
+        <w:t xml:space="preserve"> </w:t>
+      </w:r>
+      <w:r>
+        <w:rPr>
+          <w:rStyle w:val="VerbatimChar"/>
+        </w:rPr>
+        <w:t xml:space="preserve">npm install</w:t>
+      </w:r>
+      <w:r>
+        <w:t xml:space="preserve"> </w:t>
+      </w:r>
+      <w:r>
+        <w:t xml:space="preserve">en la raíz y</w:t>
+      </w:r>
+      <w:r>
+        <w:t xml:space="preserve"> </w:t>
+      </w:r>
+      <w:r>
+        <w:rPr>
+          <w:rStyle w:val="VerbatimChar"/>
+        </w:rPr>
+        <w:t xml:space="preserve">npm start</w:t>
+      </w:r>
+      <w:r>
+        <w:t xml:space="preserve"> </w:t>
+      </w:r>
+      <w:r>
+        <w:t xml:space="preserve">con un gestor de procesos (pm2).</w:t>
+      </w:r>
+    </w:p>
+    <w:p>
+      <w:pPr>
+        <w:numPr>
+          <w:ilvl w:val="0"/>
+          <w:numId w:val="1003"/>
+        </w:numPr>
+        <w:pStyle w:val="Compact"/>
+      </w:pPr>
+      <w:r>
+        <w:rPr>
+          <w:bCs/>
+          <w:b/>
+        </w:rPr>
+        <w:t xml:space="preserve">Vercel o Netlify:</w:t>
+      </w:r>
+      <w:r>
+        <w:t xml:space="preserve"> </w:t>
+      </w:r>
+      <w:r>
+        <w:t xml:space="preserve">no convienen, porque ejecutan funciones que se apagan entre visitas: se pierden los recordatorios cada 30 minutos y el límite de peticiones en memoria, y no incluyen MySQL.</w:t>
+      </w:r>
+    </w:p>
+    <w:bookmarkEnd w:id="38"/>
+    <w:bookmarkEnd w:id="39"/>
+    <w:bookmarkStart w:id="40" w:name="verificación-rápida"/>
     <w:p>
       <w:pPr>
         <w:pStyle w:val="Heading2"/>
@@ -4726,8 +6090,8 @@
         <w:t xml:space="preserve">.</w:t>
       </w:r>
     </w:p>
-    <w:bookmarkEnd w:id="37"/>
-    <w:bookmarkStart w:id="38" w:name="problemas-frecuentes"/>
+    <w:bookmarkEnd w:id="40"/>
+    <w:bookmarkStart w:id="41" w:name="problemas-frecuentes"/>
     <w:p>
       <w:pPr>
         <w:pStyle w:val="Heading2"/>
@@ -5245,8 +6609,8 @@
         </w:tc>
       </w:tr>
     </w:tbl>
-    <w:bookmarkEnd w:id="38"/>
-    <w:bookmarkEnd w:id="39"/>
+    <w:bookmarkEnd w:id="41"/>
+    <w:bookmarkEnd w:id="42"/>
     <w:sectPr/>
   </w:body>
 </w:document>
@@ -5432,6 +6796,82 @@
       <w:start w:val="1"/>
       <w:numFmt w:val="decimal"/>
       <w:lvlText w:val="%9."/>
+      <w:lvlJc w:val="left"/>
+      <w:pPr>
+        <w:ind w:left="6480" w:hanging="480"/>
+      </w:pPr>
+    </w:lvl>
+  </w:abstractNum>
+  <w:abstractNum w:abstractNumId="991">
+    <w:nsid w:val="A991"/>
+    <w:multiLevelType w:val="multilevel"/>
+    <w:lvl w:ilvl="0">
+      <w:numFmt w:val="bullet"/>
+      <w:lvlText w:val="•"/>
+      <w:lvlJc w:val="left"/>
+      <w:pPr>
+        <w:ind w:left="720" w:hanging="480"/>
+      </w:pPr>
+    </w:lvl>
+    <w:lvl w:ilvl="1">
+      <w:numFmt w:val="bullet"/>
+      <w:lvlText w:val="–"/>
+      <w:lvlJc w:val="left"/>
+      <w:pPr>
+        <w:ind w:left="1440" w:hanging="480"/>
+      </w:pPr>
+    </w:lvl>
+    <w:lvl w:ilvl="2">
+      <w:numFmt w:val="bullet"/>
+      <w:lvlText w:val="•"/>
+      <w:lvlJc w:val="left"/>
+      <w:pPr>
+        <w:ind w:left="2160" w:hanging="480"/>
+      </w:pPr>
+    </w:lvl>
+    <w:lvl w:ilvl="3">
+      <w:numFmt w:val="bullet"/>
+      <w:lvlText w:val="–"/>
+      <w:lvlJc w:val="left"/>
+      <w:pPr>
+        <w:ind w:left="2880" w:hanging="480"/>
+      </w:pPr>
+    </w:lvl>
+    <w:lvl w:ilvl="4">
+      <w:numFmt w:val="bullet"/>
+      <w:lvlText w:val="•"/>
+      <w:lvlJc w:val="left"/>
+      <w:pPr>
+        <w:ind w:left="3600" w:hanging="480"/>
+      </w:pPr>
+    </w:lvl>
+    <w:lvl w:ilvl="5">
+      <w:numFmt w:val="bullet"/>
+      <w:lvlText w:val="–"/>
+      <w:lvlJc w:val="left"/>
+      <w:pPr>
+        <w:ind w:left="4320" w:hanging="480"/>
+      </w:pPr>
+    </w:lvl>
+    <w:lvl w:ilvl="6">
+      <w:numFmt w:val="bullet"/>
+      <w:lvlText w:val="•"/>
+      <w:lvlJc w:val="left"/>
+      <w:pPr>
+        <w:ind w:left="5040" w:hanging="480"/>
+      </w:pPr>
+    </w:lvl>
+    <w:lvl w:ilvl="7">
+      <w:numFmt w:val="bullet"/>
+      <w:lvlText w:val="–"/>
+      <w:lvlJc w:val="left"/>
+      <w:pPr>
+        <w:ind w:left="5760" w:hanging="480"/>
+      </w:pPr>
+    </w:lvl>
+    <w:lvl w:ilvl="8">
+      <w:numFmt w:val="bullet"/>
+      <w:lvlText w:val="•"/>
       <w:lvlJc w:val="left"/>
       <w:pPr>
         <w:ind w:left="6480" w:hanging="480"/>
@@ -5470,6 +6910,39 @@
     <w:lvlOverride w:ilvl="8">
       <w:startOverride w:val="1"/>
     </w:lvlOverride>
+  </w:num>
+  <w:num w:numId="1002">
+    <w:abstractNumId w:val="99411"/>
+    <w:lvlOverride w:ilvl="0">
+      <w:startOverride w:val="1"/>
+    </w:lvlOverride>
+    <w:lvlOverride w:ilvl="1">
+      <w:startOverride w:val="1"/>
+    </w:lvlOverride>
+    <w:lvlOverride w:ilvl="2">
+      <w:startOverride w:val="1"/>
+    </w:lvlOverride>
+    <w:lvlOverride w:ilvl="3">
+      <w:startOverride w:val="1"/>
+    </w:lvlOverride>
+    <w:lvlOverride w:ilvl="4">
+      <w:startOverride w:val="1"/>
+    </w:lvlOverride>
+    <w:lvlOverride w:ilvl="5">
+      <w:startOverride w:val="1"/>
+    </w:lvlOverride>
+    <w:lvlOverride w:ilvl="6">
+      <w:startOverride w:val="1"/>
+    </w:lvlOverride>
+    <w:lvlOverride w:ilvl="7">
+      <w:startOverride w:val="1"/>
+    </w:lvlOverride>
+    <w:lvlOverride w:ilvl="8">
+      <w:startOverride w:val="1"/>
+    </w:lvlOverride>
+  </w:num>
+  <w:num w:numId="1003">
+    <w:abstractNumId w:val="991"/>
   </w:num>
 </w:numbering>
 </file>

</xml_diff>